<commit_message>
Commit Neal's second-round edit doc updates for N4, N6, N7, N7-T1 and N8
Saved on 2026-08-04 while the first round was being applied. Recoverable with
git checkout <this commit> -- "Module Edit Docs/N6 - Edit Doc.docx" before
make_edit_docs.py overwrites any of them.

- N6 completes the sentence that broke off at "Then s" and adds the fourth
  interface gradient to the equation list. The equation was already on the page,
  added during the pass, so the doc and the page now agree.
- N4 inserts three replacement figures for the cardiac function section.
- N7 inserts a corrected catheter illustration and moves the quadruple-lumen
  instruction into this doc.
- N7-T1 carries the catheter figure with the Thermistor spelling fixed. The
  first save of this doc did not include it, so the correction landed a round
  later than intended.
- N8 replaces the low-output figure with a version free of the PowerPoint
  speaker icon that was visible once the figure was shown at full width.
</commit_message>
<xml_diff>
--- a/Module Edit Docs/N4 - Edit Doc.docx
+++ b/Module Edit Docs/N4 - Edit Doc.docx
@@ -1751,10 +1751,146 @@
       </w:r>
     </w:p>
     <w:p>
+      <w:r>
+        <w:t>[I have inserted below a .</w:t>
+      </w:r>
+      <w:proofErr w:type="spellStart"/>
+      <w:r>
+        <w:t>png</w:t>
+      </w:r>
+      <w:proofErr w:type="spellEnd"/>
+      <w:r>
+        <w:t xml:space="preserve"> of the 3 images you use in the web page.  Replace the current images with these images. </w:t>
+      </w:r>
+    </w:p>
+    <w:p>
+      <w:r>
+        <w:lastRenderedPageBreak/>
+        <w:drawing>
+          <wp:inline distT="0" distB="0" distL="0" distR="0" wp14:anchorId="1BB95F64" wp14:editId="318D50A0">
+            <wp:extent cx="3556000" cy="2476500"/>
+            <wp:effectExtent l="0" t="0" r="0" b="0"/>
+            <wp:docPr id="2057416124" name="Picture 1"/>
+            <wp:cNvGraphicFramePr>
+              <a:graphicFrameLocks xmlns:a="http://schemas.openxmlformats.org/drawingml/2006/main" noChangeAspect="1"/>
+            </wp:cNvGraphicFramePr>
+            <a:graphic xmlns:a="http://schemas.openxmlformats.org/drawingml/2006/main">
+              <a:graphicData uri="http://schemas.openxmlformats.org/drawingml/2006/picture">
+                <pic:pic xmlns:pic="http://schemas.openxmlformats.org/drawingml/2006/picture">
+                  <pic:nvPicPr>
+                    <pic:cNvPr id="2057416124" name=""/>
+                    <pic:cNvPicPr/>
+                  </pic:nvPicPr>
+                  <pic:blipFill>
+                    <a:blip r:embed="rId10"/>
+                    <a:stretch>
+                      <a:fillRect/>
+                    </a:stretch>
+                  </pic:blipFill>
+                  <pic:spPr>
+                    <a:xfrm>
+                      <a:off x="0" y="0"/>
+                      <a:ext cx="3556000" cy="2476500"/>
+                    </a:xfrm>
+                    <a:prstGeom prst="rect">
+                      <a:avLst/>
+                    </a:prstGeom>
+                  </pic:spPr>
+                </pic:pic>
+              </a:graphicData>
+            </a:graphic>
+          </wp:inline>
+        </w:drawing>
+      </w:r>
+    </w:p>
+    <w:p>
+      <w:r>
+        <w:drawing>
+          <wp:inline distT="0" distB="0" distL="0" distR="0" wp14:anchorId="4FE39227" wp14:editId="686ACFC9">
+            <wp:extent cx="3962400" cy="2489200"/>
+            <wp:effectExtent l="0" t="0" r="0" b="0"/>
+            <wp:docPr id="1931336272" name="Picture 1"/>
+            <wp:cNvGraphicFramePr>
+              <a:graphicFrameLocks xmlns:a="http://schemas.openxmlformats.org/drawingml/2006/main" noChangeAspect="1"/>
+            </wp:cNvGraphicFramePr>
+            <a:graphic xmlns:a="http://schemas.openxmlformats.org/drawingml/2006/main">
+              <a:graphicData uri="http://schemas.openxmlformats.org/drawingml/2006/picture">
+                <pic:pic xmlns:pic="http://schemas.openxmlformats.org/drawingml/2006/picture">
+                  <pic:nvPicPr>
+                    <pic:cNvPr id="1931336272" name=""/>
+                    <pic:cNvPicPr/>
+                  </pic:nvPicPr>
+                  <pic:blipFill>
+                    <a:blip r:embed="rId11"/>
+                    <a:stretch>
+                      <a:fillRect/>
+                    </a:stretch>
+                  </pic:blipFill>
+                  <pic:spPr>
+                    <a:xfrm>
+                      <a:off x="0" y="0"/>
+                      <a:ext cx="3962400" cy="2489200"/>
+                    </a:xfrm>
+                    <a:prstGeom prst="rect">
+                      <a:avLst/>
+                    </a:prstGeom>
+                  </pic:spPr>
+                </pic:pic>
+              </a:graphicData>
+            </a:graphic>
+          </wp:inline>
+        </w:drawing>
+      </w:r>
+    </w:p>
+    <w:p>
+      <w:r>
+        <w:drawing>
+          <wp:inline distT="0" distB="0" distL="0" distR="0" wp14:anchorId="1F97EC34" wp14:editId="224D3F3D">
+            <wp:extent cx="4089400" cy="2298700"/>
+            <wp:effectExtent l="0" t="0" r="0" b="0"/>
+            <wp:docPr id="661827297" name="Picture 1"/>
+            <wp:cNvGraphicFramePr>
+              <a:graphicFrameLocks xmlns:a="http://schemas.openxmlformats.org/drawingml/2006/main" noChangeAspect="1"/>
+            </wp:cNvGraphicFramePr>
+            <a:graphic xmlns:a="http://schemas.openxmlformats.org/drawingml/2006/main">
+              <a:graphicData uri="http://schemas.openxmlformats.org/drawingml/2006/picture">
+                <pic:pic xmlns:pic="http://schemas.openxmlformats.org/drawingml/2006/picture">
+                  <pic:nvPicPr>
+                    <pic:cNvPr id="661827297" name=""/>
+                    <pic:cNvPicPr/>
+                  </pic:nvPicPr>
+                  <pic:blipFill>
+                    <a:blip r:embed="rId12"/>
+                    <a:stretch>
+                      <a:fillRect/>
+                    </a:stretch>
+                  </pic:blipFill>
+                  <pic:spPr>
+                    <a:xfrm>
+                      <a:off x="0" y="0"/>
+                      <a:ext cx="4089400" cy="2298700"/>
+                    </a:xfrm>
+                    <a:prstGeom prst="rect">
+                      <a:avLst/>
+                    </a:prstGeom>
+                  </pic:spPr>
+                </pic:pic>
+              </a:graphicData>
+            </a:graphic>
+          </wp:inline>
+        </w:drawing>
+      </w:r>
+      <w:r>
+        <w:t>]</w:t>
+      </w:r>
+    </w:p>
+    <w:p/>
+    <w:p>
       <w:pPr>
         <w:pStyle w:val="Heading2"/>
       </w:pPr>
       <w:r>
+        <w:lastRenderedPageBreak/>
         <w:t>The venous</w:t>
       </w:r>
       <w:r>
@@ -1769,11 +1905,7 @@
         <w:t xml:space="preserve">t’s worth revisiting a fact mentioned previously; </w:t>
       </w:r>
       <w:r>
-        <w:t xml:space="preserve">most of the blood volume is not in the heart or the arteries, it is sitting in the veins. The venous system behaves like a large, compliant reservoir, and the blood in it comes in two functional flavors. Unstressed volume is the blood needed just to fill the vessels to their natural, unstretched shape, like the volume in a limp balloon; it fills the container but exerts no outward push and does nothing to </w:t>
-      </w:r>
-      <w:r>
-        <w:lastRenderedPageBreak/>
-        <w:t>drive flow back to the heart. Stressed volume is the additional blood that actually distends the vessel walls. That stretch creates an outward pressure, and the average of that pressure across the whole system is the mean systemic filling pressure (Pms, also written MSFP). Because so much volume is parked in high-capacitance veins, Pms is actually quite low, on the order of 8 to 10 mmHg.</w:t>
+        <w:t>most of the blood volume is not in the heart or the arteries, it is sitting in the veins. The venous system behaves like a large, compliant reservoir, and the blood in it comes in two functional flavors. Unstressed volume is the blood needed just to fill the vessels to their natural, unstretched shape, like the volume in a limp balloon; it fills the container but exerts no outward push and does nothing to drive flow back to the heart. Stressed volume is the additional blood that actually distends the vessel walls. That stretch creates an outward pressure, and the average of that pressure across the whole system is the mean systemic filling pressure (Pms, also written MSFP). Because so much volume is parked in high-capacitance veins, Pms is actually quite low, on the order of 8 to 10 mmHg.</w:t>
       </w:r>
     </w:p>
     <w:p>
@@ -1797,7 +1929,7 @@
                     <pic:cNvPicPr/>
                   </pic:nvPicPr>
                   <pic:blipFill>
-                    <a:blip r:embed="rId10"/>
+                    <a:blip r:embed="rId13"/>
                     <a:stretch>
                       <a:fillRect/>
                     </a:stretch>
@@ -1880,6 +2012,7 @@
         <w:rPr>
           <w:noProof/>
         </w:rPr>
+        <w:lastRenderedPageBreak/>
         <w:drawing>
           <wp:inline distT="0" distB="0" distL="0" distR="0" wp14:anchorId="19409701" wp14:editId="4ECF678B">
             <wp:extent cx="5486400" cy="1223010"/>
@@ -1896,7 +2029,7 @@
                     <pic:cNvPicPr/>
                   </pic:nvPicPr>
                   <pic:blipFill>
-                    <a:blip r:embed="rId11"/>
+                    <a:blip r:embed="rId14"/>
                     <a:stretch>
                       <a:fillRect/>
                     </a:stretch>
@@ -1950,11 +2083,7 @@
         <w:t>an be changed.</w:t>
       </w:r>
       <w:r>
-        <w:t xml:space="preserve">  This occurs with the </w:t>
-      </w:r>
-      <w:r>
-        <w:lastRenderedPageBreak/>
-        <w:t xml:space="preserve">addition or removal of fluids. </w:t>
+        <w:t xml:space="preserve">  This occurs with the addition or removal of fluids. </w:t>
       </w:r>
       <w:r>
         <w:t xml:space="preserve"> Second, t</w:t>
@@ -2093,7 +2222,7 @@
                     <pic:cNvPicPr/>
                   </pic:nvPicPr>
                   <pic:blipFill>
-                    <a:blip r:embed="rId12"/>
+                    <a:blip r:embed="rId15"/>
                     <a:stretch>
                       <a:fillRect/>
                     </a:stretch>
@@ -2116,6 +2245,7 @@
     </w:p>
     <w:p>
       <w:r>
+        <w:lastRenderedPageBreak/>
         <w:t xml:space="preserve">[Add the above graphic.  Add the following caption below: “The point at which </w:t>
       </w:r>
       <w:proofErr w:type="spellStart"/>
@@ -2158,11 +2288,7 @@
       </w:r>
       <w:proofErr w:type="spellEnd"/>
       <w:r>
-        <w:t xml:space="preserve">, is zero represents the x-intercept and the </w:t>
-      </w:r>
-      <w:r>
-        <w:lastRenderedPageBreak/>
-        <w:t xml:space="preserve">point where venous return is zero.  </w:t>
+        <w:t xml:space="preserve">, is zero represents the x-intercept and the point where venous return is zero.  </w:t>
       </w:r>
       <w:r>
         <w:t>If we assume that P</w:t>
@@ -2233,7 +2359,7 @@
                     <pic:cNvPicPr/>
                   </pic:nvPicPr>
                   <pic:blipFill>
-                    <a:blip r:embed="rId13"/>
+                    <a:blip r:embed="rId16"/>
                     <a:stretch>
                       <a:fillRect/>
                     </a:stretch>
@@ -2438,7 +2564,11 @@
       </w:r>
       <w:proofErr w:type="gramEnd"/>
       <w:r>
-        <w:t xml:space="preserve"> an increase in resistance would lower the slope of the curve and a decrease in resistance would increase the slope.  </w:t>
+        <w:t xml:space="preserve"> an increase in resistance would </w:t>
+      </w:r>
+      <w:r>
+        <w:lastRenderedPageBreak/>
+        <w:t xml:space="preserve">lower the slope of the curve and a decrease in resistance would increase the slope.  </w:t>
       </w:r>
       <w:r>
         <w:t>I</w:t>
@@ -2477,7 +2607,6 @@
         <w:rPr>
           <w:noProof/>
         </w:rPr>
-        <w:lastRenderedPageBreak/>
         <w:drawing>
           <wp:inline distT="0" distB="0" distL="0" distR="0" wp14:anchorId="1B707BD4" wp14:editId="454B3EDE">
             <wp:extent cx="2768600" cy="2362200"/>
@@ -2494,7 +2623,7 @@
                     <pic:cNvPicPr/>
                   </pic:nvPicPr>
                   <pic:blipFill>
-                    <a:blip r:embed="rId14"/>
+                    <a:blip r:embed="rId17"/>
                     <a:stretch>
                       <a:fillRect/>
                     </a:stretch>
@@ -2586,7 +2715,7 @@
                     <pic:cNvPicPr/>
                   </pic:nvPicPr>
                   <pic:blipFill>
-                    <a:blip r:embed="rId15"/>
+                    <a:blip r:embed="rId18"/>
                     <a:stretch>
                       <a:fillRect/>
                     </a:stretch>
@@ -2609,6 +2738,7 @@
     </w:p>
     <w:p>
       <w:r>
+        <w:lastRenderedPageBreak/>
         <w:t xml:space="preserve">[Add the graphic above and place the following caption below it: “As Pra falls relative to </w:t>
       </w:r>
       <w:proofErr w:type="spellStart"/>
@@ -2637,11 +2767,7 @@
         <w:t>in the abdomen</w:t>
       </w:r>
       <w:r>
-        <w:t xml:space="preserve"> stay open only while the pressure inside them </w:t>
-      </w:r>
-      <w:r>
-        <w:lastRenderedPageBreak/>
-        <w:t>exceeds the pressure around them, a positive transmural pressure.</w:t>
+        <w:t xml:space="preserve"> stay open only while the pressure inside them exceeds the pressure around them, a positive transmural pressure.</w:t>
       </w:r>
       <w:r>
         <w:t xml:space="preserve"> As RAP drops, the intravascular pressure within the abdominal inferior vena cava </w:t>
@@ -2847,6 +2973,7 @@
         <w:rPr>
           <w:sz w:val="19"/>
         </w:rPr>
+        <w:lastRenderedPageBreak/>
         <w:t>Guyton AC, Hall JE. Textbook of Medical Physiology. 12th ed. Philadelphia: Saunders Elsevier; 2011.</w:t>
       </w:r>
     </w:p>
@@ -4033,7 +4160,6 @@
   <w:style w:type="character" w:default="1" w:styleId="DefaultParagraphFont">
     <w:name w:val="Default Paragraph Font"/>
     <w:uiPriority w:val="1"/>
-    <w:semiHidden/>
     <w:unhideWhenUsed/>
   </w:style>
   <w:style w:type="table" w:default="1" w:styleId="TableNormal">

</xml_diff>